<commit_message>
Add rest days, milestone retrospectives, menu topic sheets, CI guard, physics alternates
</commit_message>
<xml_diff>
--- a/plan/cpp-engine-master-plan-v3.5.docx
+++ b/plan/cpp-engine-master-plan-v3.5.docx
@@ -1395,6 +1395,38 @@
       </w:r>
     </w:p>
     <w:p>
+      <w:r>
+        <w:t xml:space="preserve">11. </w:t>
+      </w:r>
+      <w:r>
+        <w:rPr>
+          <w:b/>
+        </w:rPr>
+        <w:t xml:space="preserve">Rest days are scheduled, not failures.</w:t>
+      </w:r>
+      <w:r>
+        <w:t xml:space="preserve"> Three full days off — </w:t>
+      </w:r>
+      <w:r>
+        <w:rPr>
+          <w:b/>
+        </w:rPr>
+        <w:t xml:space="preserve">no code, no reading, no networking</w:t>
+      </w:r>
+      <w:r>
+        <w:t xml:space="preserve"> — land right after the heaviest pushes: </w:t>
+      </w:r>
+      <w:r>
+        <w:rPr>
+          <w:b/>
+        </w:rPr>
+        <w:t xml:space="preserve">after Day 21, after Day 70, after Day 119</w:t>
+      </w:r>
+      <w:r>
+        <w:t xml:space="preserve">. They're marked in the tracker as REST DAY 1 / 2 / 3. Taking them is never a "buffer slip"; you resume exactly where you left off the next day.</w:t>
+      </w:r>
+    </w:p>
+    <w:p>
       <w:pPr>
         <w:pStyle w:val="Heading1"/>
       </w:pPr>
@@ -4604,10 +4636,36 @@
         <w:rPr>
           <w:b/>
         </w:rPr>
+        <w:t xml:space="preserve">Retrospective:</w:t>
+      </w:r>
+      <w:r>
+        <w:t xml:space="preserve"> Write 3 sentences into </w:t>
+      </w:r>
+      <w:r>
+        <w:rPr>
+          <w:rFonts w:ascii="Consolas" w:hAnsi="Consolas" w:cs="Consolas"/>
+        </w:rPr>
+        <w:t xml:space="preserve">docs/retrospectives.md</w:t>
+      </w:r>
+      <w:r>
+        <w:t xml:space="preserve"> — what went wrong in Phase 0, what you'd change, what surprised you. (Portfolio-grade: this is how you show you actually work.)</w:t>
+      </w:r>
+    </w:p>
+    <w:p>
+      <w:pPr>
+        <w:ind w:left="567" w:hanging="283"/>
+      </w:pPr>
+      <w:r>
+        <w:t>•</w:t>
+      </w:r>
+      <w:r>
+        <w:rPr>
+          <w:b/>
+        </w:rPr>
         <w:t xml:space="preserve">Done:</w:t>
       </w:r>
       <w:r>
-        <w:t xml:space="preserve"> Tag pushed, pitch written, one networking action done.</w:t>
+        <w:t xml:space="preserve"> Tag pushed, pitch written, one networking action done, retrospective written.</w:t>
       </w:r>
     </w:p>
     <w:p>
@@ -9124,10 +9182,36 @@
         <w:rPr>
           <w:b/>
         </w:rPr>
+        <w:t xml:space="preserve">Retrospective:</w:t>
+      </w:r>
+      <w:r>
+        <w:t xml:space="preserve"> 3 sentences into </w:t>
+      </w:r>
+      <w:r>
+        <w:rPr>
+          <w:rFonts w:ascii="Consolas" w:hAnsi="Consolas" w:cs="Consolas"/>
+        </w:rPr>
+        <w:t xml:space="preserve">docs/retrospectives.md</w:t>
+      </w:r>
+      <w:r>
+        <w:t xml:space="preserve"> — what went wrong in Phase 1, what you'd change, what surprised you.</w:t>
+      </w:r>
+    </w:p>
+    <w:p>
+      <w:pPr>
+        <w:ind w:left="567" w:hanging="283"/>
+      </w:pPr>
+      <w:r>
+        <w:t>•</w:t>
+      </w:r>
+      <w:r>
+        <w:rPr>
+          <w:b/>
+        </w:rPr>
         <w:t xml:space="preserve">Done:</w:t>
       </w:r>
       <w:r>
-        <w:t xml:space="preserve"> Tag + post live; you can answer why the scene is impressive in 30 seconds.</w:t>
+        <w:t xml:space="preserve"> Tag + post live; you can answer why the scene is impressive in 30 seconds; retrospective written.</w:t>
       </w:r>
     </w:p>
     <w:p>
@@ -13548,10 +13632,36 @@
         <w:rPr>
           <w:b/>
         </w:rPr>
+        <w:t xml:space="preserve">Retrospective:</w:t>
+      </w:r>
+      <w:r>
+        <w:t xml:space="preserve"> 3 sentences into </w:t>
+      </w:r>
+      <w:r>
+        <w:rPr>
+          <w:rFonts w:ascii="Consolas" w:hAnsi="Consolas" w:cs="Consolas"/>
+        </w:rPr>
+        <w:t xml:space="preserve">docs/retrospectives.md</w:t>
+      </w:r>
+      <w:r>
+        <w:t xml:space="preserve"> — what went wrong in Phase 2, what you'd change, what surprised you.</w:t>
+      </w:r>
+    </w:p>
+    <w:p>
+      <w:pPr>
+        <w:ind w:left="567" w:hanging="283"/>
+      </w:pPr>
+      <w:r>
+        <w:t>•</w:t>
+      </w:r>
+      <w:r>
+        <w:rPr>
+          <w:b/>
+        </w:rPr>
         <w:t xml:space="preserve">Done:</w:t>
       </w:r>
       <w:r>
-        <w:t xml:space="preserve"> Tag + post live; a stranger can play your game from the repo.</w:t>
+        <w:t xml:space="preserve"> Tag + post live; a stranger can play your game from the repo; retrospective written.</w:t>
       </w:r>
     </w:p>
     <w:p>
@@ -15480,7 +15590,43 @@
         <w:t xml:space="preserve">Build:</w:t>
       </w:r>
       <w:r>
-        <w:t xml:space="preserve"> Choose 4 stack topics; write one line of rationale for each tied to a target studio.</w:t>
+        <w:t xml:space="preserve"> Choose 4 stack topics; write one line of rationale for each tied to a target studio. Then spend 30 more minutes filling your </w:t>
+      </w:r>
+      <w:r>
+        <w:rPr>
+          <w:b/>
+        </w:rPr>
+        <w:t xml:space="preserve">topic sheet</w:t>
+      </w:r>
+      <w:r>
+        <w:t xml:space="preserve">: for each of the 4, write its </w:t>
+      </w:r>
+      <w:r>
+        <w:rPr>
+          <w:b/>
+        </w:rPr>
+        <w:t xml:space="preserve">primary source</w:t>
+      </w:r>
+      <w:r>
+        <w:t xml:space="preserve">, one </w:t>
+      </w:r>
+      <w:r>
+        <w:rPr>
+          <w:b/>
+        </w:rPr>
+        <w:t xml:space="preserve">"why games care"</w:t>
+      </w:r>
+      <w:r>
+        <w:t xml:space="preserve"> example, and one </w:t>
+      </w:r>
+      <w:r>
+        <w:rPr>
+          <w:b/>
+        </w:rPr>
+        <w:t xml:space="preserve">interview-style question you would ask</w:t>
+      </w:r>
+      <w:r>
+        <w:t xml:space="preserve">. Add the new sources to Appendix D.</w:t>
       </w:r>
     </w:p>
     <w:p>
@@ -15497,7 +15643,7 @@
         <w:t xml:space="preserve">Done:</w:t>
       </w:r>
       <w:r>
-        <w:t xml:space="preserve"> The selection is written and justified; you feel the guilt of skipping the rest — that's the point.</w:t>
+        <w:t xml:space="preserve"> Selection written and justified; each topic has a source + a "why games care" example + one interview question on the sheet (this sheet powers Days 107–118); you feel the guilt of skipping the rest — that's the point.</w:t>
       </w:r>
     </w:p>
     <w:p>
@@ -19029,7 +19175,7 @@
         <w:t xml:space="preserve">Done:</w:t>
       </w:r>
       <w:r>
-        <w:t xml:space="preserve"> Green badge; fresh clone builds via CI.</w:t>
+        <w:t xml:space="preserve"> Green badge; fresh clone builds via CI. If it eats the whole day, cut to a single green build badge and finish CI after Day 140 — never trade an application-send day for a badge.</w:t>
       </w:r>
     </w:p>
     <w:p>
@@ -19658,10 +19804,36 @@
         <w:rPr>
           <w:b/>
         </w:rPr>
+        <w:t xml:space="preserve">Retrospective:</w:t>
+      </w:r>
+      <w:r>
+        <w:t xml:space="preserve"> The final one into </w:t>
+      </w:r>
+      <w:r>
+        <w:rPr>
+          <w:rFonts w:ascii="Consolas" w:hAnsi="Consolas" w:cs="Consolas"/>
+        </w:rPr>
+        <w:t xml:space="preserve">docs/retrospectives.md</w:t>
+      </w:r>
+      <w:r>
+        <w:t xml:space="preserve"> — what went wrong across all four phases, what you'd change, what surprised you. (4 retrospectives = the story of how you learned, and it closes the portfolio.)</w:t>
+      </w:r>
+    </w:p>
+    <w:p>
+      <w:pPr>
+        <w:ind w:left="567" w:hanging="283"/>
+      </w:pPr>
+      <w:r>
+        <w:t>•</w:t>
+      </w:r>
+      <w:r>
+        <w:rPr>
+          <w:b/>
+        </w:rPr>
         <w:t xml:space="preserve">Done:</w:t>
       </w:r>
       <w:r>
-        <w:t xml:space="preserve"> Final tag + pitch live; next-90-days plan written; Day 1 of *tomorrow* defined.</w:t>
+        <w:t xml:space="preserve"> Final tag + pitch live; next-90-days plan written; retrospective #4 written; Day 1 of *tomorrow* defined.</w:t>
       </w:r>
     </w:p>
     <w:p>
@@ -20037,7 +20209,7 @@
     <w:p/>
     <w:p>
       <w:r>
-        <w:t xml:space="preserve">Habit checks that ride along every day: commit that stands alone · sanitizer session at least weekly · clang-tidy nearing clean · 20 interview questions done by Day 140 · 20 pitch refreshes banked.</w:t>
+        <w:t xml:space="preserve">Habit checks that ride along every day: commit that stands alone · sanitizer session at least weekly · clang-tidy nearing clean · 20 interview questions done by Day 140 · 20 pitch refreshes banked · milestone retrospectives written (Days 21, 56, 91, 140).</w:t>
       </w:r>
     </w:p>
     <w:p>
@@ -21072,7 +21244,16 @@
         <w:t xml:space="preserve">Practice</w:t>
       </w:r>
       <w:r>
-        <w:t xml:space="preserve"> = where the "Build" tasks live.</w:t>
+        <w:t xml:space="preserve"> = where the "Build" tasks live. </w:t>
+      </w:r>
+      <w:r>
+        <w:rPr>
+          <w:b/>
+        </w:rPr>
+        <w:t xml:space="preserve">This map is a living document</w:t>
+      </w:r>
+      <w:r>
+        <w:t xml:space="preserve"> — when you find a better source than one listed, swap it in and add a row.</w:t>
       </w:r>
     </w:p>
     <w:tbl>
@@ -21359,7 +21540,22 @@
               <w:t xml:space="preserve">K. Sun, "How to Create a Custom 2D Physics Engine"</w:t>
             </w:r>
             <w:r>
-              <w:t xml:space="preserve"> (free archive series)</w:t>
+              <w:t xml:space="preserve"> (free archive series); alternates: </w:t>
+            </w:r>
+            <w:r>
+              <w:rPr>
+                <w:b/>
+              </w:rPr>
+              <w:t xml:space="preserve">Randy Gaul's Impulse Engine / "How to build a physics engine"</w:t>
+            </w:r>
+            <w:r>
+              <w:t xml:space="preserve"> (tutsplus) and the </w:t>
+            </w:r>
+            <w:r>
+              <w:rPr>
+                <w:b/>
+              </w:rPr>
+              <w:t xml:space="preserve">Box2D manual</w:t>
             </w:r>
           </w:p>
         </w:tc>
@@ -21373,7 +21569,7 @@
               <w:spacing w:after="40" w:line="240" w:lineRule="auto"/>
             </w:pPr>
             <w:r>
-              <w:t xml:space="preserve">The core of Phase 2 physics. Follow chapters, write your own in your engine.</w:t>
+              <w:t xml:space="preserve">The core of Phase 2 physics. Follow chapters, write your own in your engine. If a K. Sun lesson doesn't click, switch teachers instantly — same physics, different voice, no guilt.</w:t>
             </w:r>
           </w:p>
         </w:tc>

</xml_diff>

<commit_message>
Add Phase 0 -> LearnCpp chapter map; swap Days 17/18; bake rest days into tracker gen
</commit_message>
<xml_diff>
--- a/plan/cpp-engine-master-plan-v3.5.docx
+++ b/plan/cpp-engine-master-plan-v3.5.docx
@@ -1503,6 +1503,796 @@
         <w:pStyle w:val="Heading3"/>
       </w:pPr>
       <w:r>
+        <w:t xml:space="preserve">Phase 0 → LearnCpp chapter map (skip nothing: click each day's lesson)</w:t>
+      </w:r>
+    </w:p>
+    <w:p>
+      <w:r>
+        <w:t xml:space="preserve">LearnCpp has renumbered its chapters; the plan reads it non-linearly, so every important topic is still covered — ch 10–15 land on Days 3, 4, 6, 8–9, 12, 13, 17. Each day's </w:t>
+      </w:r>
+      <w:r>
+        <w:rPr>
+          <w:rFonts w:ascii="Consolas" w:hAnsi="Consolas" w:cs="Consolas"/>
+        </w:rPr>
+        <w:t xml:space="preserve">Learn:</w:t>
+      </w:r>
+      <w:r>
+        <w:t xml:space="preserve"> line names the lesson; this table gives the exact chapter numbers and the direct link:</w:t>
+      </w:r>
+    </w:p>
+    <w:tbl>
+      <w:tblPr>
+        <w:tblW w:w="0" w:type="auto"/>
+        <w:tblBorders>
+          <w:top w:val="single" w:sz="4" w:space="0" w:color="999999"/>
+          <w:left w:val="single" w:sz="4" w:space="0" w:color="999999"/>
+          <w:bottom w:val="single" w:sz="4" w:space="0" w:color="999999"/>
+          <w:right w:val="single" w:sz="4" w:space="0" w:color="999999"/>
+          <w:insideH w:val="single" w:sz="4" w:space="0" w:color="999999"/>
+          <w:insideV w:val="single" w:sz="4" w:space="0" w:color="999999"/>
+        </w:tblBorders>
+        <w:tblLayout w:type="fixed"/>
+      </w:tblPr>
+      <w:tblGrid>
+        <w:gridCol w:w="3120"/>
+        <w:gridCol w:w="3120"/>
+        <w:gridCol w:w="3120"/>
+      </w:tblGrid>
+      <w:tr>
+        <w:tc>
+          <w:tcPr>
+            <w:tcW w:w="3120" w:type="dxa"/>
+            <w:vAlign w:val="center"/>
+          </w:tcPr>
+          <w:p>
+            <w:pPr>
+              <w:spacing w:after="40" w:line="240" w:lineRule="auto"/>
+            </w:pPr>
+            <w:r>
+              <w:t xml:space="preserve">Day</w:t>
+            </w:r>
+          </w:p>
+        </w:tc>
+        <w:tc>
+          <w:tcPr>
+            <w:tcW w:w="3120" w:type="dxa"/>
+            <w:vAlign w:val="center"/>
+          </w:tcPr>
+          <w:p>
+            <w:pPr>
+              <w:spacing w:after="40" w:line="240" w:lineRule="auto"/>
+            </w:pPr>
+            <w:r>
+              <w:t xml:space="preserve">LearnCpp chapter(s)</w:t>
+            </w:r>
+          </w:p>
+        </w:tc>
+        <w:tc>
+          <w:tcPr>
+            <w:tcW w:w="3120" w:type="dxa"/>
+            <w:vAlign w:val="center"/>
+          </w:tcPr>
+          <w:p>
+            <w:pPr>
+              <w:spacing w:after="40" w:line="240" w:lineRule="auto"/>
+            </w:pPr>
+            <w:r>
+              <w:t xml:space="preserve">Direct link</w:t>
+            </w:r>
+          </w:p>
+        </w:tc>
+      </w:tr>
+      <w:tr>
+        <w:tc>
+          <w:tcPr>
+            <w:tcW w:w="3120" w:type="dxa"/>
+            <w:vAlign w:val="center"/>
+          </w:tcPr>
+          <w:p>
+            <w:pPr>
+              <w:spacing w:after="40" w:line="240" w:lineRule="auto"/>
+            </w:pPr>
+            <w:r>
+              <w:t xml:space="preserve">1</w:t>
+            </w:r>
+          </w:p>
+        </w:tc>
+        <w:tc>
+          <w:tcPr>
+            <w:tcW w:w="3120" w:type="dxa"/>
+            <w:vAlign w:val="center"/>
+          </w:tcPr>
+          <w:p>
+            <w:pPr>
+              <w:spacing w:after="40" w:line="240" w:lineRule="auto"/>
+            </w:pPr>
+            <w:r>
+              <w:t xml:space="preserve">ch 8.13–8.15 (random numbers — the 3 lessons after ch 8.12)</w:t>
+            </w:r>
+          </w:p>
+        </w:tc>
+        <w:tc>
+          <w:tcPr>
+            <w:tcW w:w="3120" w:type="dxa"/>
+            <w:vAlign w:val="center"/>
+          </w:tcPr>
+          <w:p>
+            <w:pPr>
+              <w:spacing w:after="40" w:line="240" w:lineRule="auto"/>
+            </w:pPr>
+            <w:r>
+              <w:t xml:space="preserve">https://www.learncpp.com/cpp-tutorial/introduction-to-random-number-generation/</w:t>
+            </w:r>
+          </w:p>
+        </w:tc>
+      </w:tr>
+      <w:tr>
+        <w:tc>
+          <w:tcPr>
+            <w:tcW w:w="3120" w:type="dxa"/>
+            <w:vAlign w:val="center"/>
+          </w:tcPr>
+          <w:p>
+            <w:pPr>
+              <w:spacing w:after="40" w:line="240" w:lineRule="auto"/>
+            </w:pPr>
+            <w:r>
+              <w:t xml:space="preserve">2</w:t>
+            </w:r>
+          </w:p>
+        </w:tc>
+        <w:tc>
+          <w:tcPr>
+            <w:tcW w:w="3120" w:type="dxa"/>
+            <w:vAlign w:val="center"/>
+          </w:tcPr>
+          <w:p>
+            <w:pPr>
+              <w:spacing w:after="40" w:line="240" w:lineRule="auto"/>
+            </w:pPr>
+            <w:r>
+              <w:t xml:space="preserve">ch 5.7–5.9 (strings)</w:t>
+            </w:r>
+          </w:p>
+        </w:tc>
+        <w:tc>
+          <w:tcPr>
+            <w:tcW w:w="3120" w:type="dxa"/>
+            <w:vAlign w:val="center"/>
+          </w:tcPr>
+          <w:p>
+            <w:pPr>
+              <w:spacing w:after="40" w:line="240" w:lineRule="auto"/>
+            </w:pPr>
+            <w:r>
+              <w:t xml:space="preserve">https://www.learncpp.com/cpp-tutorial/introduction-to-stdstring/</w:t>
+            </w:r>
+          </w:p>
+        </w:tc>
+      </w:tr>
+      <w:tr>
+        <w:tc>
+          <w:tcPr>
+            <w:tcW w:w="3120" w:type="dxa"/>
+            <w:vAlign w:val="center"/>
+          </w:tcPr>
+          <w:p>
+            <w:pPr>
+              <w:spacing w:after="40" w:line="240" w:lineRule="auto"/>
+            </w:pPr>
+            <w:r>
+              <w:t xml:space="preserve">3</w:t>
+            </w:r>
+          </w:p>
+        </w:tc>
+        <w:tc>
+          <w:tcPr>
+            <w:tcW w:w="3120" w:type="dxa"/>
+            <w:vAlign w:val="center"/>
+          </w:tcPr>
+          <w:p>
+            <w:pPr>
+              <w:spacing w:after="40" w:line="240" w:lineRule="auto"/>
+            </w:pPr>
+            <w:r>
+              <w:t xml:space="preserve">ch 11.1–11.5 (overloads, defaults)</w:t>
+            </w:r>
+          </w:p>
+        </w:tc>
+        <w:tc>
+          <w:tcPr>
+            <w:tcW w:w="3120" w:type="dxa"/>
+            <w:vAlign w:val="center"/>
+          </w:tcPr>
+          <w:p>
+            <w:pPr>
+              <w:spacing w:after="40" w:line="240" w:lineRule="auto"/>
+            </w:pPr>
+            <w:r>
+              <w:t xml:space="preserve">https://www.learncpp.com/cpp-tutorial/introduction-to-function-overloading/</w:t>
+            </w:r>
+          </w:p>
+        </w:tc>
+      </w:tr>
+      <w:tr>
+        <w:tc>
+          <w:tcPr>
+            <w:tcW w:w="3120" w:type="dxa"/>
+            <w:vAlign w:val="center"/>
+          </w:tcPr>
+          <w:p>
+            <w:pPr>
+              <w:spacing w:after="40" w:line="240" w:lineRule="auto"/>
+            </w:pPr>
+            <w:r>
+              <w:t xml:space="preserve">4</w:t>
+            </w:r>
+          </w:p>
+        </w:tc>
+        <w:tc>
+          <w:tcPr>
+            <w:tcW w:w="3120" w:type="dxa"/>
+            <w:vAlign w:val="center"/>
+          </w:tcPr>
+          <w:p>
+            <w:pPr>
+              <w:spacing w:after="40" w:line="240" w:lineRule="auto"/>
+            </w:pPr>
+            <w:r>
+              <w:t xml:space="preserve">ch 10 (conversions, aliases, deduction)</w:t>
+            </w:r>
+          </w:p>
+        </w:tc>
+        <w:tc>
+          <w:tcPr>
+            <w:tcW w:w="3120" w:type="dxa"/>
+            <w:vAlign w:val="center"/>
+          </w:tcPr>
+          <w:p>
+            <w:pPr>
+              <w:spacing w:after="40" w:line="240" w:lineRule="auto"/>
+            </w:pPr>
+            <w:r>
+              <w:t xml:space="preserve">https://www.learncpp.com/cpp-tutorial/implicit-type-conversion/</w:t>
+            </w:r>
+          </w:p>
+        </w:tc>
+      </w:tr>
+      <w:tr>
+        <w:tc>
+          <w:tcPr>
+            <w:tcW w:w="3120" w:type="dxa"/>
+            <w:vAlign w:val="center"/>
+          </w:tcPr>
+          <w:p>
+            <w:pPr>
+              <w:spacing w:after="40" w:line="240" w:lineRule="auto"/>
+            </w:pPr>
+            <w:r>
+              <w:t xml:space="preserve">5</w:t>
+            </w:r>
+          </w:p>
+        </w:tc>
+        <w:tc>
+          <w:tcPr>
+            <w:tcW w:w="3120" w:type="dxa"/>
+            <w:vAlign w:val="center"/>
+          </w:tcPr>
+          <w:p>
+            <w:pPr>
+              <w:spacing w:after="40" w:line="240" w:lineRule="auto"/>
+            </w:pPr>
+            <w:r>
+              <w:t xml:space="preserve">ch 20.6–20.7 (lambdas, captures)</w:t>
+            </w:r>
+          </w:p>
+        </w:tc>
+        <w:tc>
+          <w:tcPr>
+            <w:tcW w:w="3120" w:type="dxa"/>
+            <w:vAlign w:val="center"/>
+          </w:tcPr>
+          <w:p>
+            <w:pPr>
+              <w:spacing w:after="40" w:line="240" w:lineRule="auto"/>
+            </w:pPr>
+            <w:r>
+              <w:t xml:space="preserve">https://www.learncpp.com/cpp-tutorial/introduction-to-lambdas-anonymous-functions/</w:t>
+            </w:r>
+          </w:p>
+        </w:tc>
+      </w:tr>
+      <w:tr>
+        <w:tc>
+          <w:tcPr>
+            <w:tcW w:w="3120" w:type="dxa"/>
+            <w:vAlign w:val="center"/>
+          </w:tcPr>
+          <w:p>
+            <w:pPr>
+              <w:spacing w:after="40" w:line="240" w:lineRule="auto"/>
+            </w:pPr>
+            <w:r>
+              <w:t xml:space="preserve">6</w:t>
+            </w:r>
+          </w:p>
+        </w:tc>
+        <w:tc>
+          <w:tcPr>
+            <w:tcW w:w="3120" w:type="dxa"/>
+            <w:vAlign w:val="center"/>
+          </w:tcPr>
+          <w:p>
+            <w:pPr>
+              <w:spacing w:after="40" w:line="240" w:lineRule="auto"/>
+            </w:pPr>
+            <w:r>
+              <w:t xml:space="preserve">ch 16 (std::vector) + ch 13.6–13.7 (enums, structs)</w:t>
+            </w:r>
+          </w:p>
+        </w:tc>
+        <w:tc>
+          <w:tcPr>
+            <w:tcW w:w="3120" w:type="dxa"/>
+            <w:vAlign w:val="center"/>
+          </w:tcPr>
+          <w:p>
+            <w:pPr>
+              <w:spacing w:after="40" w:line="240" w:lineRule="auto"/>
+            </w:pPr>
+            <w:r>
+              <w:t xml:space="preserve">https://www.learncpp.com/cpp-tutorial/introduction-to-containers-and-arrays/</w:t>
+            </w:r>
+          </w:p>
+        </w:tc>
+      </w:tr>
+      <w:tr>
+        <w:tc>
+          <w:tcPr>
+            <w:tcW w:w="3120" w:type="dxa"/>
+            <w:vAlign w:val="center"/>
+          </w:tcPr>
+          <w:p>
+            <w:pPr>
+              <w:spacing w:after="40" w:line="240" w:lineRule="auto"/>
+            </w:pPr>
+            <w:r>
+              <w:t xml:space="preserve">8</w:t>
+            </w:r>
+          </w:p>
+        </w:tc>
+        <w:tc>
+          <w:tcPr>
+            <w:tcW w:w="3120" w:type="dxa"/>
+            <w:vAlign w:val="center"/>
+          </w:tcPr>
+          <w:p>
+            <w:pPr>
+              <w:spacing w:after="40" w:line="240" w:lineRule="auto"/>
+            </w:pPr>
+            <w:r>
+              <w:t xml:space="preserve">ch 14.2, 14.4 (classes)</w:t>
+            </w:r>
+          </w:p>
+        </w:tc>
+        <w:tc>
+          <w:tcPr>
+            <w:tcW w:w="3120" w:type="dxa"/>
+            <w:vAlign w:val="center"/>
+          </w:tcPr>
+          <w:p>
+            <w:pPr>
+              <w:spacing w:after="40" w:line="240" w:lineRule="auto"/>
+            </w:pPr>
+            <w:r>
+              <w:t xml:space="preserve">https://www.learncpp.com/cpp-tutorial/introduction-to-classes/</w:t>
+            </w:r>
+          </w:p>
+        </w:tc>
+      </w:tr>
+      <w:tr>
+        <w:tc>
+          <w:tcPr>
+            <w:tcW w:w="3120" w:type="dxa"/>
+            <w:vAlign w:val="center"/>
+          </w:tcPr>
+          <w:p>
+            <w:pPr>
+              <w:spacing w:after="40" w:line="240" w:lineRule="auto"/>
+            </w:pPr>
+            <w:r>
+              <w:t xml:space="preserve">9</w:t>
+            </w:r>
+          </w:p>
+        </w:tc>
+        <w:tc>
+          <w:tcPr>
+            <w:tcW w:w="3120" w:type="dxa"/>
+            <w:vAlign w:val="center"/>
+          </w:tcPr>
+          <w:p>
+            <w:pPr>
+              <w:spacing w:after="40" w:line="240" w:lineRule="auto"/>
+            </w:pPr>
+            <w:r>
+              <w:t xml:space="preserve">ch 14.9–14.16 (constructors)</w:t>
+            </w:r>
+          </w:p>
+        </w:tc>
+        <w:tc>
+          <w:tcPr>
+            <w:tcW w:w="3120" w:type="dxa"/>
+            <w:vAlign w:val="center"/>
+          </w:tcPr>
+          <w:p>
+            <w:pPr>
+              <w:spacing w:after="40" w:line="240" w:lineRule="auto"/>
+            </w:pPr>
+            <w:r>
+              <w:t xml:space="preserve">https://www.learncpp.com/cpp-tutorial/introduction-to-constructors/</w:t>
+            </w:r>
+          </w:p>
+        </w:tc>
+      </w:tr>
+      <w:tr>
+        <w:tc>
+          <w:tcPr>
+            <w:tcW w:w="3120" w:type="dxa"/>
+            <w:vAlign w:val="center"/>
+          </w:tcPr>
+          <w:p>
+            <w:pPr>
+              <w:spacing w:after="40" w:line="240" w:lineRule="auto"/>
+            </w:pPr>
+            <w:r>
+              <w:t xml:space="preserve">10</w:t>
+            </w:r>
+          </w:p>
+        </w:tc>
+        <w:tc>
+          <w:tcPr>
+            <w:tcW w:w="3120" w:type="dxa"/>
+            <w:vAlign w:val="center"/>
+          </w:tcPr>
+          <w:p>
+            <w:pPr>
+              <w:spacing w:after="40" w:line="240" w:lineRule="auto"/>
+            </w:pPr>
+            <w:r>
+              <w:t xml:space="preserve">ch 14.14–14.15 + 21.13 (copy semantics)</w:t>
+            </w:r>
+          </w:p>
+        </w:tc>
+        <w:tc>
+          <w:tcPr>
+            <w:tcW w:w="3120" w:type="dxa"/>
+            <w:vAlign w:val="center"/>
+          </w:tcPr>
+          <w:p>
+            <w:pPr>
+              <w:spacing w:after="40" w:line="240" w:lineRule="auto"/>
+            </w:pPr>
+            <w:r>
+              <w:t xml:space="preserve">https://www.learncpp.com/cpp-tutorial/introduction-to-the-copy-constructor/</w:t>
+            </w:r>
+          </w:p>
+        </w:tc>
+      </w:tr>
+      <w:tr>
+        <w:tc>
+          <w:tcPr>
+            <w:tcW w:w="3120" w:type="dxa"/>
+            <w:vAlign w:val="center"/>
+          </w:tcPr>
+          <w:p>
+            <w:pPr>
+              <w:spacing w:after="40" w:line="240" w:lineRule="auto"/>
+            </w:pPr>
+            <w:r>
+              <w:t xml:space="preserve">11</w:t>
+            </w:r>
+          </w:p>
+        </w:tc>
+        <w:tc>
+          <w:tcPr>
+            <w:tcW w:w="3120" w:type="dxa"/>
+            <w:vAlign w:val="center"/>
+          </w:tcPr>
+          <w:p>
+            <w:pPr>
+              <w:spacing w:after="40" w:line="240" w:lineRule="auto"/>
+            </w:pPr>
+            <w:r>
+              <w:t xml:space="preserve">ch 22.1–22.4 (move semantics)</w:t>
+            </w:r>
+          </w:p>
+        </w:tc>
+        <w:tc>
+          <w:tcPr>
+            <w:tcW w:w="3120" w:type="dxa"/>
+            <w:vAlign w:val="center"/>
+          </w:tcPr>
+          <w:p>
+            <w:pPr>
+              <w:spacing w:after="40" w:line="240" w:lineRule="auto"/>
+            </w:pPr>
+            <w:r>
+              <w:t xml:space="preserve">https://www.learncpp.com/cpp-tutorial/rvalue-references/</w:t>
+            </w:r>
+          </w:p>
+        </w:tc>
+      </w:tr>
+      <w:tr>
+        <w:tc>
+          <w:tcPr>
+            <w:tcW w:w="3120" w:type="dxa"/>
+            <w:vAlign w:val="center"/>
+          </w:tcPr>
+          <w:p>
+            <w:pPr>
+              <w:spacing w:after="40" w:line="240" w:lineRule="auto"/>
+            </w:pPr>
+            <w:r>
+              <w:t xml:space="preserve">12</w:t>
+            </w:r>
+          </w:p>
+        </w:tc>
+        <w:tc>
+          <w:tcPr>
+            <w:tcW w:w="3120" w:type="dxa"/>
+            <w:vAlign w:val="center"/>
+          </w:tcPr>
+          <w:p>
+            <w:pPr>
+              <w:spacing w:after="40" w:line="240" w:lineRule="auto"/>
+            </w:pPr>
+            <w:r>
+              <w:t xml:space="preserve">ch 15.4 (destructors, RAII)</w:t>
+            </w:r>
+          </w:p>
+        </w:tc>
+        <w:tc>
+          <w:tcPr>
+            <w:tcW w:w="3120" w:type="dxa"/>
+            <w:vAlign w:val="center"/>
+          </w:tcPr>
+          <w:p>
+            <w:pPr>
+              <w:spacing w:after="40" w:line="240" w:lineRule="auto"/>
+            </w:pPr>
+            <w:r>
+              <w:t xml:space="preserve">https://www.learncpp.com/cpp-tutorial/introduction-to-destructors/</w:t>
+            </w:r>
+          </w:p>
+        </w:tc>
+      </w:tr>
+      <w:tr>
+        <w:tc>
+          <w:tcPr>
+            <w:tcW w:w="3120" w:type="dxa"/>
+            <w:vAlign w:val="center"/>
+          </w:tcPr>
+          <w:p>
+            <w:pPr>
+              <w:spacing w:after="40" w:line="240" w:lineRule="auto"/>
+            </w:pPr>
+            <w:r>
+              <w:t xml:space="preserve">13</w:t>
+            </w:r>
+          </w:p>
+        </w:tc>
+        <w:tc>
+          <w:tcPr>
+            <w:tcW w:w="3120" w:type="dxa"/>
+            <w:vAlign w:val="center"/>
+          </w:tcPr>
+          <w:p>
+            <w:pPr>
+              <w:spacing w:after="40" w:line="240" w:lineRule="auto"/>
+            </w:pPr>
+            <w:r>
+              <w:t xml:space="preserve">ch 24.1–24.2 + 25.1, 25.2, 25.6 (inheritance, virtual, vtable)</w:t>
+            </w:r>
+          </w:p>
+        </w:tc>
+        <w:tc>
+          <w:tcPr>
+            <w:tcW w:w="3120" w:type="dxa"/>
+            <w:vAlign w:val="center"/>
+          </w:tcPr>
+          <w:p>
+            <w:pPr>
+              <w:spacing w:after="40" w:line="240" w:lineRule="auto"/>
+            </w:pPr>
+            <w:r>
+              <w:t xml:space="preserve">https://www.learncpp.com/cpp-tutorial/virtual-functions/</w:t>
+            </w:r>
+          </w:p>
+        </w:tc>
+      </w:tr>
+      <w:tr>
+        <w:tc>
+          <w:tcPr>
+            <w:tcW w:w="3120" w:type="dxa"/>
+            <w:vAlign w:val="center"/>
+          </w:tcPr>
+          <w:p>
+            <w:pPr>
+              <w:spacing w:after="40" w:line="240" w:lineRule="auto"/>
+            </w:pPr>
+            <w:r>
+              <w:t xml:space="preserve">15</w:t>
+            </w:r>
+          </w:p>
+        </w:tc>
+        <w:tc>
+          <w:tcPr>
+            <w:tcW w:w="3120" w:type="dxa"/>
+            <w:vAlign w:val="center"/>
+          </w:tcPr>
+          <w:p>
+            <w:pPr>
+              <w:spacing w:after="40" w:line="240" w:lineRule="auto"/>
+            </w:pPr>
+            <w:r>
+              <w:t xml:space="preserve">ch 11.6 + 13.13 (function + class templates)</w:t>
+            </w:r>
+          </w:p>
+        </w:tc>
+        <w:tc>
+          <w:tcPr>
+            <w:tcW w:w="3120" w:type="dxa"/>
+            <w:vAlign w:val="center"/>
+          </w:tcPr>
+          <w:p>
+            <w:pPr>
+              <w:spacing w:after="40" w:line="240" w:lineRule="auto"/>
+            </w:pPr>
+            <w:r>
+              <w:t xml:space="preserve">https://www.learncpp.com/cpp-tutorial/function-templates/</w:t>
+            </w:r>
+          </w:p>
+        </w:tc>
+      </w:tr>
+      <w:tr>
+        <w:tc>
+          <w:tcPr>
+            <w:tcW w:w="3120" w:type="dxa"/>
+            <w:vAlign w:val="center"/>
+          </w:tcPr>
+          <w:p>
+            <w:pPr>
+              <w:spacing w:after="40" w:line="240" w:lineRule="auto"/>
+            </w:pPr>
+            <w:r>
+              <w:t xml:space="preserve">16</w:t>
+            </w:r>
+          </w:p>
+        </w:tc>
+        <w:tc>
+          <w:tcPr>
+            <w:tcW w:w="3120" w:type="dxa"/>
+            <w:vAlign w:val="center"/>
+          </w:tcPr>
+          <w:p>
+            <w:pPr>
+              <w:spacing w:after="40" w:line="240" w:lineRule="auto"/>
+            </w:pPr>
+            <w:r>
+              <w:t xml:space="preserve">ch 27.1–27.4 (exceptions)</w:t>
+            </w:r>
+          </w:p>
+        </w:tc>
+        <w:tc>
+          <w:tcPr>
+            <w:tcW w:w="3120" w:type="dxa"/>
+            <w:vAlign w:val="center"/>
+          </w:tcPr>
+          <w:p>
+            <w:pPr>
+              <w:spacing w:after="40" w:line="240" w:lineRule="auto"/>
+            </w:pPr>
+            <w:r>
+              <w:t xml:space="preserve">https://www.learncpp.com/cpp-tutorial/basic-exception-handling/</w:t>
+            </w:r>
+          </w:p>
+        </w:tc>
+      </w:tr>
+      <w:tr>
+        <w:tc>
+          <w:tcPr>
+            <w:tcW w:w="3120" w:type="dxa"/>
+            <w:vAlign w:val="center"/>
+          </w:tcPr>
+          <w:p>
+            <w:pPr>
+              <w:spacing w:after="40" w:line="240" w:lineRule="auto"/>
+            </w:pPr>
+            <w:r>
+              <w:t xml:space="preserve">17</w:t>
+            </w:r>
+          </w:p>
+        </w:tc>
+        <w:tc>
+          <w:tcPr>
+            <w:tcW w:w="3120" w:type="dxa"/>
+            <w:vAlign w:val="center"/>
+          </w:tcPr>
+          <w:p>
+            <w:pPr>
+              <w:spacing w:after="40" w:line="240" w:lineRule="auto"/>
+            </w:pPr>
+            <w:r>
+              <w:t xml:space="preserve">ch 12.1–12.12 (references &amp; pointers) + 17.8–17.9 (decay, arithmetic)</w:t>
+            </w:r>
+          </w:p>
+        </w:tc>
+        <w:tc>
+          <w:tcPr>
+            <w:tcW w:w="3120" w:type="dxa"/>
+            <w:vAlign w:val="center"/>
+          </w:tcPr>
+          <w:p>
+            <w:pPr>
+              <w:spacing w:after="40" w:line="240" w:lineRule="auto"/>
+            </w:pPr>
+            <w:r>
+              <w:t xml:space="preserve">https://www.learncpp.com/cpp-tutorial/introduction-to-pointers/</w:t>
+            </w:r>
+          </w:p>
+        </w:tc>
+      </w:tr>
+      <w:tr>
+        <w:tc>
+          <w:tcPr>
+            <w:tcW w:w="3120" w:type="dxa"/>
+            <w:vAlign w:val="center"/>
+          </w:tcPr>
+          <w:p>
+            <w:pPr>
+              <w:spacing w:after="40" w:line="240" w:lineRule="auto"/>
+            </w:pPr>
+            <w:r>
+              <w:t xml:space="preserve">18</w:t>
+            </w:r>
+          </w:p>
+        </w:tc>
+        <w:tc>
+          <w:tcPr>
+            <w:tcW w:w="3120" w:type="dxa"/>
+            <w:vAlign w:val="center"/>
+          </w:tcPr>
+          <w:p>
+            <w:pPr>
+              <w:spacing w:after="40" w:line="240" w:lineRule="auto"/>
+            </w:pPr>
+            <w:r>
+              <w:t xml:space="preserve">ch 22.5–22.7 (unique_ptr, shared_ptr, weak_ptr)</w:t>
+            </w:r>
+          </w:p>
+        </w:tc>
+        <w:tc>
+          <w:tcPr>
+            <w:tcW w:w="3120" w:type="dxa"/>
+            <w:vAlign w:val="center"/>
+          </w:tcPr>
+          <w:p>
+            <w:pPr>
+              <w:spacing w:after="40" w:line="240" w:lineRule="auto"/>
+            </w:pPr>
+            <w:r>
+              <w:t xml:space="preserve">https://www.learncpp.com/cpp-tutorial/stdunique_ptr/</w:t>
+            </w:r>
+          </w:p>
+        </w:tc>
+      </w:tr>
+    </w:tbl>
+    <w:p/>
+    <w:p>
+      <w:pPr>
+        <w:pStyle w:val="Heading3"/>
+      </w:pPr>
+      <w:r>
         <w:t xml:space="preserve">Week 1 (Days 1–7) — Finish Core C++</w:t>
       </w:r>
     </w:p>
@@ -2370,7 +3160,7 @@
         <w:t xml:space="preserve">Learn:</w:t>
       </w:r>
       <w:r>
-        <w:t xml:space="preserve"> LearnCpp — "Introduction to std::vector", "std::map", "std::set", "std::unordered_map". cppreference as dictionary.</w:t>
+        <w:t xml:space="preserve"> LearnCpp ch 16 — "Introduction to std::vector" (16.1–16.2), range-based for (16.8), resizing (16.10–16.11); plus ch 13.6 "Scoped enumerations" and 13.7 "Introduction to structs". LearnCpp has no std::map/set lessons — use cppreference as a dictionary for map/set/unordered_map when Days 20–21 and later phases need them.</w:t>
       </w:r>
     </w:p>
     <w:p>
@@ -3377,7 +4167,7 @@
         <w:t xml:space="preserve">Learn:</w:t>
       </w:r>
       <w:r>
-        <w:t xml:space="preserve"> LearnCpp — "Virtual functions" and the lesson on vtable-style polymorphism.</w:t>
+        <w:t xml:space="preserve"> LearnCpp ch 24–25 — inheritance basics (24.1–24.2), "Virtual functions and polymorphism" (25.2), "The virtual table" (25.6). One page to start: https://www.learncpp.com/cpp-tutorial/virtual-functions/</w:t>
       </w:r>
     </w:p>
     <w:p>
@@ -3922,7 +4712,7 @@
         <w:rPr>
           <w:b/>
         </w:rPr>
-        <w:t xml:space="preserve">Day 17 — Smart Pointers, The Ownership Toolkit</w:t>
+        <w:t xml:space="preserve">Day 17 — Memory Bootcamp 1: Pointer Deep Dive</w:t>
       </w:r>
     </w:p>
     <w:p>
@@ -3939,6 +4729,122 @@
         <w:t xml:space="preserve">In plain words:</w:t>
       </w:r>
       <w:r>
+        <w:t xml:space="preserve"> The pure pointers day: what an address is, how arrays secretly decay into them, and how to read an impossible-looking const pointer. You'll draw it and then verify each drawing in the debugger.</w:t>
+      </w:r>
+    </w:p>
+    <w:p>
+      <w:pPr>
+        <w:ind w:left="567" w:hanging="283"/>
+      </w:pPr>
+      <w:r>
+        <w:t>•</w:t>
+      </w:r>
+      <w:r>
+        <w:rPr>
+          <w:b/>
+        </w:rPr>
+        <w:t xml:space="preserve">Summary:</w:t>
+      </w:r>
+      <w:r>
+        <w:t xml:space="preserve"> The pointer matrix that interviews test: decay, arithmetic, const, double pointers.</w:t>
+      </w:r>
+    </w:p>
+    <w:p>
+      <w:pPr>
+        <w:ind w:left="567" w:hanging="283"/>
+      </w:pPr>
+      <w:r>
+        <w:t>•</w:t>
+      </w:r>
+      <w:r>
+        <w:rPr>
+          <w:b/>
+        </w:rPr>
+        <w:t xml:space="preserve">Learn:</w:t>
+      </w:r>
+      <w:r>
+        <w:t xml:space="preserve"> LearnCpp ch 12 "Compound types: references and pointers" — lessons 12.1–12.12 (especially "Introduction to pointers" 12.7, "Pointers and const" 12.9) + ch 17.8 "C-style array decay" + 17.9 "Pointer arithmetic and subscripting". One page to start: https://www.learncpp.com/cpp-tutorial/introduction-to-pointers/</w:t>
+      </w:r>
+    </w:p>
+    <w:p>
+      <w:pPr>
+        <w:ind w:left="567" w:hanging="283"/>
+      </w:pPr>
+      <w:r>
+        <w:t>•</w:t>
+      </w:r>
+      <w:r>
+        <w:rPr>
+          <w:b/>
+        </w:rPr>
+        <w:t xml:space="preserve">Roadmap:</w:t>
+      </w:r>
+      <w:r>
+        <w:t xml:space="preserve"> pointer arithmetic · array decay · const-pointer matrix · pointer-to-pointer · the debugger memory window</w:t>
+      </w:r>
+    </w:p>
+    <w:p>
+      <w:pPr>
+        <w:ind w:left="567" w:hanging="283"/>
+      </w:pPr>
+      <w:r>
+        <w:t>•</w:t>
+      </w:r>
+      <w:r>
+        <w:rPr>
+          <w:b/>
+        </w:rPr>
+        <w:t xml:space="preserve">Build:</w:t>
+      </w:r>
+      <w:r>
+        <w:t xml:space="preserve"> A pointer quiz taken to 100%; draw four memory diagrams *and* verify each against the debugger.</w:t>
+      </w:r>
+    </w:p>
+    <w:p>
+      <w:pPr>
+        <w:ind w:left="567" w:hanging="283"/>
+      </w:pPr>
+      <w:r>
+        <w:t>•</w:t>
+      </w:r>
+      <w:r>
+        <w:rPr>
+          <w:b/>
+        </w:rPr>
+        <w:t xml:space="preserve">Done:</w:t>
+      </w:r>
+      <w:r>
+        <w:t xml:space="preserve"> Diagrams match the debugger for all four; you can explain decay to an interviewer.</w:t>
+      </w:r>
+    </w:p>
+    <w:p>
+      <w:pPr>
+        <w:ind w:left="567" w:hanging="283"/>
+      </w:pPr>
+      <w:r>
+        <w:t>•</w:t>
+      </w:r>
+      <w:r>
+        <w:rPr>
+          <w:b/>
+        </w:rPr>
+        <w:t xml:space="preserve">Day 18 — Smart Pointers, The Ownership Toolkit</w:t>
+      </w:r>
+    </w:p>
+    <w:p>
+      <w:pPr>
+        <w:ind w:left="567" w:hanging="283"/>
+      </w:pPr>
+      <w:r>
+        <w:t>•</w:t>
+      </w:r>
+      <w:r>
+        <w:rPr>
+          <w:b/>
+        </w:rPr>
+        <w:t xml:space="preserve">In plain words:</w:t>
+      </w:r>
+      <w:r>
         <w:t xml:space="preserve"> "Who owns this object and when is it deleted?" Smart pointers answer that for you — one-owner (unique_ptr), shared-owner (shared_ptr). This replaces Unity's garbage collector by hand.</w:t>
       </w:r>
     </w:p>
@@ -3973,7 +4879,7 @@
         <w:t xml:space="preserve">Learn:</w:t>
       </w:r>
       <w:r>
-        <w:t xml:space="preserve"> LearnCpp — "Smart pointers", "std::unique_ptr", "std::shared_ptr".</w:t>
+        <w:t xml:space="preserve"> LearnCpp ch 22 "Move semantics and smart pointers" — "std::unique_ptr" (22.5), "std::shared_ptr" (22.6), and weak_ptr/cycles (22.7). One page to start: https://www.learncpp.com/cpp-tutorial/stdunique_ptr/</w:t>
       </w:r>
     </w:p>
     <w:p>
@@ -4097,122 +5003,6 @@
       </w:r>
       <w:r>
         <w:t xml:space="preserve"> should be rare.</w:t>
-      </w:r>
-    </w:p>
-    <w:p>
-      <w:pPr>
-        <w:ind w:left="567" w:hanging="283"/>
-      </w:pPr>
-      <w:r>
-        <w:t>•</w:t>
-      </w:r>
-      <w:r>
-        <w:rPr>
-          <w:b/>
-        </w:rPr>
-        <w:t xml:space="preserve">Day 18 — Memory Bootcamp 1: Pointer Deep Dive</w:t>
-      </w:r>
-    </w:p>
-    <w:p>
-      <w:pPr>
-        <w:ind w:left="567" w:hanging="283"/>
-      </w:pPr>
-      <w:r>
-        <w:t>•</w:t>
-      </w:r>
-      <w:r>
-        <w:rPr>
-          <w:b/>
-        </w:rPr>
-        <w:t xml:space="preserve">In plain words:</w:t>
-      </w:r>
-      <w:r>
-        <w:t xml:space="preserve"> The pure pointers day: what an address is, how arrays secretly decay into them, and how to read an impossible-looking const pointer. You'll draw it and then verify each drawing in the debugger.</w:t>
-      </w:r>
-    </w:p>
-    <w:p>
-      <w:pPr>
-        <w:ind w:left="567" w:hanging="283"/>
-      </w:pPr>
-      <w:r>
-        <w:t>•</w:t>
-      </w:r>
-      <w:r>
-        <w:rPr>
-          <w:b/>
-        </w:rPr>
-        <w:t xml:space="preserve">Summary:</w:t>
-      </w:r>
-      <w:r>
-        <w:t xml:space="preserve"> The pointer matrix that interviews test: decay, arithmetic, const, double pointers.</w:t>
-      </w:r>
-    </w:p>
-    <w:p>
-      <w:pPr>
-        <w:ind w:left="567" w:hanging="283"/>
-      </w:pPr>
-      <w:r>
-        <w:t>•</w:t>
-      </w:r>
-      <w:r>
-        <w:rPr>
-          <w:b/>
-        </w:rPr>
-        <w:t xml:space="preserve">Learn:</w:t>
-      </w:r>
-      <w:r>
-        <w:t xml:space="preserve"> LearnCpp — chapter "Compound types" (pointers) + the memory/address sections; then your debugger memory window.</w:t>
-      </w:r>
-    </w:p>
-    <w:p>
-      <w:pPr>
-        <w:ind w:left="567" w:hanging="283"/>
-      </w:pPr>
-      <w:r>
-        <w:t>•</w:t>
-      </w:r>
-      <w:r>
-        <w:rPr>
-          <w:b/>
-        </w:rPr>
-        <w:t xml:space="preserve">Roadmap:</w:t>
-      </w:r>
-      <w:r>
-        <w:t xml:space="preserve"> pointer arithmetic · array decay · const-pointer matrix · pointer-to-pointer · the debugger memory window</w:t>
-      </w:r>
-    </w:p>
-    <w:p>
-      <w:pPr>
-        <w:ind w:left="567" w:hanging="283"/>
-      </w:pPr>
-      <w:r>
-        <w:t>•</w:t>
-      </w:r>
-      <w:r>
-        <w:rPr>
-          <w:b/>
-        </w:rPr>
-        <w:t xml:space="preserve">Build:</w:t>
-      </w:r>
-      <w:r>
-        <w:t xml:space="preserve"> A pointer quiz taken to 100%; draw four memory diagrams *and* verify each against the debugger.</w:t>
-      </w:r>
-    </w:p>
-    <w:p>
-      <w:pPr>
-        <w:ind w:left="567" w:hanging="283"/>
-      </w:pPr>
-      <w:r>
-        <w:t>•</w:t>
-      </w:r>
-      <w:r>
-        <w:rPr>
-          <w:b/>
-        </w:rPr>
-        <w:t xml:space="preserve">Done:</w:t>
-      </w:r>
-      <w:r>
-        <w:t xml:space="preserve"> Diagrams match the debugger for all four; you can explain decay to an interviewer.</w:t>
       </w:r>
     </w:p>
     <w:p>

</xml_diff>